<commit_message>
Prepare GO BP manuscript section and legends, clarify figures and append sensitivity summary
</commit_message>
<xml_diff>
--- a/results/Supplementary/Supplementary_Material_GO_BP.docx
+++ b/results/Supplementary/Supplementary_Material_GO_BP.docx
@@ -21454,6 +21454,918 @@
           <w:sz w:val="20"/>
         </w:rPr>
         <w:t>Positive log2FC denotes higher expression in neuropathy versus control. FDR values retain the original whole-study gene adjustment; bold values are &lt;0.05. OIPN: GSE160543; NC: GSE246156; CCI: GSE212311. Opposite expression directions do not establish OIPN specificity or a formal interaction between models.</w:t>
+      </w:r>
+    </w:p>
+    <w:p>
+      <w:r>
+        <w:br w:type="page"/>
+      </w:r>
+    </w:p>
+    <w:p>
+      <w:pPr>
+        <w:keepNext/>
+      </w:pPr>
+      <w:r>
+        <w:rPr>
+          <w:b/>
+        </w:rPr>
+        <w:t>Table S3. Selected evidence sensitivity and GSEA-GSVA concordance.</w:t>
+      </w:r>
+    </w:p>
+    <w:p>
+      <w:r>
+        <w:t>Counts summarize the locked 37 shared and five opposite-direction genes and 11 shared and nine opposite-direction pathways. OIPN: GSE160543; NC: GSE246156; CCI: GSE212311.</w:t>
+      </w:r>
+    </w:p>
+    <w:tbl>
+      <w:tblPr>
+        <w:tblStyle w:val="TableGrid"/>
+        <w:tblW w:type="auto" w:w="0"/>
+        <w:tblLayout w:type="fixed"/>
+        <w:tblLook w:firstColumn="1" w:firstRow="1" w:lastColumn="0" w:lastRow="0" w:noHBand="0" w:noVBand="1" w:val="04A0"/>
+      </w:tblPr>
+      <w:tblGrid>
+        <w:gridCol w:w="4752"/>
+        <w:gridCol w:w="1440"/>
+        <w:gridCol w:w="950"/>
+        <w:gridCol w:w="950"/>
+        <w:gridCol w:w="950"/>
+      </w:tblGrid>
+      <w:tr>
+        <w:trPr>
+          <w:tblHeader w:val="true"/>
+          <w:cantSplit/>
+        </w:trPr>
+        <w:tc>
+          <w:tcPr>
+            <w:tcW w:type="dxa" w:w="2102"/>
+          </w:tcPr>
+          <w:p>
+            <w:pPr>
+              <w:spacing w:after="80"/>
+            </w:pPr>
+            <w:r>
+              <w:rPr>
+                <w:rFonts w:ascii="Times New Roman" w:hAnsi="Times New Roman"/>
+                <w:b/>
+                <w:sz w:val="20"/>
+              </w:rPr>
+              <w:t>Measure</w:t>
+            </w:r>
+          </w:p>
+        </w:tc>
+        <w:tc>
+          <w:tcPr>
+            <w:tcW w:type="dxa" w:w="2102"/>
+          </w:tcPr>
+          <w:p>
+            <w:pPr>
+              <w:spacing w:after="80"/>
+            </w:pPr>
+            <w:r>
+              <w:rPr>
+                <w:rFonts w:ascii="Times New Roman" w:hAnsi="Times New Roman"/>
+                <w:b/>
+                <w:sz w:val="20"/>
+              </w:rPr>
+              <w:t>Category</w:t>
+            </w:r>
+          </w:p>
+        </w:tc>
+        <w:tc>
+          <w:tcPr>
+            <w:tcW w:type="dxa" w:w="2102"/>
+          </w:tcPr>
+          <w:p>
+            <w:pPr>
+              <w:spacing w:after="80"/>
+            </w:pPr>
+            <w:r>
+              <w:rPr>
+                <w:rFonts w:ascii="Times New Roman" w:hAnsi="Times New Roman"/>
+                <w:b/>
+                <w:sz w:val="20"/>
+              </w:rPr>
+              <w:t>OIPN</w:t>
+            </w:r>
+          </w:p>
+        </w:tc>
+        <w:tc>
+          <w:tcPr>
+            <w:tcW w:type="dxa" w:w="2102"/>
+          </w:tcPr>
+          <w:p>
+            <w:pPr>
+              <w:spacing w:after="80"/>
+            </w:pPr>
+            <w:r>
+              <w:rPr>
+                <w:rFonts w:ascii="Times New Roman" w:hAnsi="Times New Roman"/>
+                <w:b/>
+                <w:sz w:val="20"/>
+              </w:rPr>
+              <w:t>NC</w:t>
+            </w:r>
+          </w:p>
+        </w:tc>
+        <w:tc>
+          <w:tcPr>
+            <w:tcW w:type="dxa" w:w="2102"/>
+          </w:tcPr>
+          <w:p>
+            <w:pPr>
+              <w:spacing w:after="80"/>
+            </w:pPr>
+            <w:r>
+              <w:rPr>
+                <w:rFonts w:ascii="Times New Roman" w:hAnsi="Times New Roman"/>
+                <w:b/>
+                <w:sz w:val="20"/>
+              </w:rPr>
+              <w:t>CCI</w:t>
+            </w:r>
+          </w:p>
+        </w:tc>
+      </w:tr>
+      <w:tr>
+        <w:trPr>
+          <w:cantSplit/>
+        </w:trPr>
+        <w:tc>
+          <w:tcPr>
+            <w:tcW w:type="dxa" w:w="4752"/>
+          </w:tcPr>
+          <w:p>
+            <w:pPr>
+              <w:spacing w:after="80"/>
+            </w:pPr>
+            <w:r>
+              <w:rPr>
+                <w:rFonts w:ascii="Times New Roman" w:hAnsi="Times New Roman"/>
+                <w:b w:val="0"/>
+                <w:sz w:val="20"/>
+              </w:rPr>
+              <w:t>Genes retaining direction after every omission</w:t>
+            </w:r>
+          </w:p>
+        </w:tc>
+        <w:tc>
+          <w:tcPr>
+            <w:tcW w:type="dxa" w:w="1440"/>
+          </w:tcPr>
+          <w:p>
+            <w:pPr>
+              <w:spacing w:after="80"/>
+            </w:pPr>
+            <w:r>
+              <w:rPr>
+                <w:rFonts w:ascii="Times New Roman" w:hAnsi="Times New Roman"/>
+                <w:b w:val="0"/>
+                <w:sz w:val="20"/>
+              </w:rPr>
+              <w:t>Shared</w:t>
+            </w:r>
+          </w:p>
+        </w:tc>
+        <w:tc>
+          <w:tcPr>
+            <w:tcW w:type="dxa" w:w="950"/>
+          </w:tcPr>
+          <w:p>
+            <w:pPr>
+              <w:spacing w:after="80"/>
+            </w:pPr>
+            <w:r>
+              <w:rPr>
+                <w:rFonts w:ascii="Times New Roman" w:hAnsi="Times New Roman"/>
+                <w:b w:val="0"/>
+                <w:sz w:val="20"/>
+              </w:rPr>
+              <w:t>37/37</w:t>
+            </w:r>
+          </w:p>
+        </w:tc>
+        <w:tc>
+          <w:tcPr>
+            <w:tcW w:type="dxa" w:w="950"/>
+          </w:tcPr>
+          <w:p>
+            <w:pPr>
+              <w:spacing w:after="80"/>
+            </w:pPr>
+            <w:r>
+              <w:rPr>
+                <w:rFonts w:ascii="Times New Roman" w:hAnsi="Times New Roman"/>
+                <w:b w:val="0"/>
+                <w:sz w:val="20"/>
+              </w:rPr>
+              <w:t>36/37</w:t>
+            </w:r>
+          </w:p>
+        </w:tc>
+        <w:tc>
+          <w:tcPr>
+            <w:tcW w:type="dxa" w:w="950"/>
+          </w:tcPr>
+          <w:p>
+            <w:pPr>
+              <w:spacing w:after="80"/>
+            </w:pPr>
+            <w:r>
+              <w:rPr>
+                <w:rFonts w:ascii="Times New Roman" w:hAnsi="Times New Roman"/>
+                <w:b w:val="0"/>
+                <w:sz w:val="20"/>
+              </w:rPr>
+              <w:t>33/37</w:t>
+            </w:r>
+          </w:p>
+        </w:tc>
+      </w:tr>
+      <w:tr>
+        <w:trPr>
+          <w:cantSplit/>
+        </w:trPr>
+        <w:tc>
+          <w:tcPr>
+            <w:tcW w:type="dxa" w:w="4752"/>
+          </w:tcPr>
+          <w:p>
+            <w:pPr>
+              <w:spacing w:after="80"/>
+            </w:pPr>
+            <w:r>
+              <w:rPr>
+                <w:rFonts w:ascii="Times New Roman" w:hAnsi="Times New Roman"/>
+                <w:b w:val="0"/>
+                <w:sz w:val="20"/>
+              </w:rPr>
+              <w:t>Genes retaining direction after every omission</w:t>
+            </w:r>
+          </w:p>
+        </w:tc>
+        <w:tc>
+          <w:tcPr>
+            <w:tcW w:type="dxa" w:w="1440"/>
+          </w:tcPr>
+          <w:p>
+            <w:pPr>
+              <w:spacing w:after="80"/>
+            </w:pPr>
+            <w:r>
+              <w:rPr>
+                <w:rFonts w:ascii="Times New Roman" w:hAnsi="Times New Roman"/>
+                <w:b w:val="0"/>
+                <w:sz w:val="20"/>
+              </w:rPr>
+              <w:t>Opposite</w:t>
+            </w:r>
+          </w:p>
+        </w:tc>
+        <w:tc>
+          <w:tcPr>
+            <w:tcW w:type="dxa" w:w="950"/>
+          </w:tcPr>
+          <w:p>
+            <w:pPr>
+              <w:spacing w:after="80"/>
+            </w:pPr>
+            <w:r>
+              <w:rPr>
+                <w:rFonts w:ascii="Times New Roman" w:hAnsi="Times New Roman"/>
+                <w:b w:val="0"/>
+                <w:sz w:val="20"/>
+              </w:rPr>
+              <w:t>5/5</w:t>
+            </w:r>
+          </w:p>
+        </w:tc>
+        <w:tc>
+          <w:tcPr>
+            <w:tcW w:type="dxa" w:w="950"/>
+          </w:tcPr>
+          <w:p>
+            <w:pPr>
+              <w:spacing w:after="80"/>
+            </w:pPr>
+            <w:r>
+              <w:rPr>
+                <w:rFonts w:ascii="Times New Roman" w:hAnsi="Times New Roman"/>
+                <w:b w:val="0"/>
+                <w:sz w:val="20"/>
+              </w:rPr>
+              <w:t>5/5</w:t>
+            </w:r>
+          </w:p>
+        </w:tc>
+        <w:tc>
+          <w:tcPr>
+            <w:tcW w:type="dxa" w:w="950"/>
+          </w:tcPr>
+          <w:p>
+            <w:pPr>
+              <w:spacing w:after="80"/>
+            </w:pPr>
+            <w:r>
+              <w:rPr>
+                <w:rFonts w:ascii="Times New Roman" w:hAnsi="Times New Roman"/>
+                <w:b w:val="0"/>
+                <w:sz w:val="20"/>
+              </w:rPr>
+              <w:t>1/5</w:t>
+            </w:r>
+          </w:p>
+        </w:tc>
+      </w:tr>
+      <w:tr>
+        <w:trPr>
+          <w:cantSplit/>
+        </w:trPr>
+        <w:tc>
+          <w:tcPr>
+            <w:tcW w:type="dxa" w:w="4752"/>
+          </w:tcPr>
+          <w:p>
+            <w:pPr>
+              <w:spacing w:after="80"/>
+            </w:pPr>
+            <w:r>
+              <w:rPr>
+                <w:rFonts w:ascii="Times New Roman" w:hAnsi="Times New Roman"/>
+                <w:b w:val="0"/>
+                <w:sz w:val="20"/>
+              </w:rPr>
+              <w:t>Pathway GSVA effects retaining direction after every omission</w:t>
+            </w:r>
+          </w:p>
+        </w:tc>
+        <w:tc>
+          <w:tcPr>
+            <w:tcW w:type="dxa" w:w="1440"/>
+          </w:tcPr>
+          <w:p>
+            <w:pPr>
+              <w:spacing w:after="80"/>
+            </w:pPr>
+            <w:r>
+              <w:rPr>
+                <w:rFonts w:ascii="Times New Roman" w:hAnsi="Times New Roman"/>
+                <w:b w:val="0"/>
+                <w:sz w:val="20"/>
+              </w:rPr>
+              <w:t>Shared</w:t>
+            </w:r>
+          </w:p>
+        </w:tc>
+        <w:tc>
+          <w:tcPr>
+            <w:tcW w:type="dxa" w:w="950"/>
+          </w:tcPr>
+          <w:p>
+            <w:pPr>
+              <w:spacing w:after="80"/>
+            </w:pPr>
+            <w:r>
+              <w:rPr>
+                <w:rFonts w:ascii="Times New Roman" w:hAnsi="Times New Roman"/>
+                <w:b w:val="0"/>
+                <w:sz w:val="20"/>
+              </w:rPr>
+              <w:t>11/11</w:t>
+            </w:r>
+          </w:p>
+        </w:tc>
+        <w:tc>
+          <w:tcPr>
+            <w:tcW w:type="dxa" w:w="950"/>
+          </w:tcPr>
+          <w:p>
+            <w:pPr>
+              <w:spacing w:after="80"/>
+            </w:pPr>
+            <w:r>
+              <w:rPr>
+                <w:rFonts w:ascii="Times New Roman" w:hAnsi="Times New Roman"/>
+                <w:b w:val="0"/>
+                <w:sz w:val="20"/>
+              </w:rPr>
+              <w:t>10/11</w:t>
+            </w:r>
+          </w:p>
+        </w:tc>
+        <w:tc>
+          <w:tcPr>
+            <w:tcW w:type="dxa" w:w="950"/>
+          </w:tcPr>
+          <w:p>
+            <w:pPr>
+              <w:spacing w:after="80"/>
+            </w:pPr>
+            <w:r>
+              <w:rPr>
+                <w:rFonts w:ascii="Times New Roman" w:hAnsi="Times New Roman"/>
+                <w:b w:val="0"/>
+                <w:sz w:val="20"/>
+              </w:rPr>
+              <w:t>11/11</w:t>
+            </w:r>
+          </w:p>
+        </w:tc>
+      </w:tr>
+      <w:tr>
+        <w:trPr>
+          <w:cantSplit/>
+        </w:trPr>
+        <w:tc>
+          <w:tcPr>
+            <w:tcW w:type="dxa" w:w="4752"/>
+          </w:tcPr>
+          <w:p>
+            <w:pPr>
+              <w:spacing w:after="80"/>
+            </w:pPr>
+            <w:r>
+              <w:rPr>
+                <w:rFonts w:ascii="Times New Roman" w:hAnsi="Times New Roman"/>
+                <w:b w:val="0"/>
+                <w:sz w:val="20"/>
+              </w:rPr>
+              <w:t>Pathway GSVA effects retaining direction after every omission</w:t>
+            </w:r>
+          </w:p>
+        </w:tc>
+        <w:tc>
+          <w:tcPr>
+            <w:tcW w:type="dxa" w:w="1440"/>
+          </w:tcPr>
+          <w:p>
+            <w:pPr>
+              <w:spacing w:after="80"/>
+            </w:pPr>
+            <w:r>
+              <w:rPr>
+                <w:rFonts w:ascii="Times New Roman" w:hAnsi="Times New Roman"/>
+                <w:b w:val="0"/>
+                <w:sz w:val="20"/>
+              </w:rPr>
+              <w:t>Opposite</w:t>
+            </w:r>
+          </w:p>
+        </w:tc>
+        <w:tc>
+          <w:tcPr>
+            <w:tcW w:type="dxa" w:w="950"/>
+          </w:tcPr>
+          <w:p>
+            <w:pPr>
+              <w:spacing w:after="80"/>
+            </w:pPr>
+            <w:r>
+              <w:rPr>
+                <w:rFonts w:ascii="Times New Roman" w:hAnsi="Times New Roman"/>
+                <w:b w:val="0"/>
+                <w:sz w:val="20"/>
+              </w:rPr>
+              <w:t>9/9</w:t>
+            </w:r>
+          </w:p>
+        </w:tc>
+        <w:tc>
+          <w:tcPr>
+            <w:tcW w:type="dxa" w:w="950"/>
+          </w:tcPr>
+          <w:p>
+            <w:pPr>
+              <w:spacing w:after="80"/>
+            </w:pPr>
+            <w:r>
+              <w:rPr>
+                <w:rFonts w:ascii="Times New Roman" w:hAnsi="Times New Roman"/>
+                <w:b w:val="0"/>
+                <w:sz w:val="20"/>
+              </w:rPr>
+              <w:t>4/9</w:t>
+            </w:r>
+          </w:p>
+        </w:tc>
+        <w:tc>
+          <w:tcPr>
+            <w:tcW w:type="dxa" w:w="950"/>
+          </w:tcPr>
+          <w:p>
+            <w:pPr>
+              <w:spacing w:after="80"/>
+            </w:pPr>
+            <w:r>
+              <w:rPr>
+                <w:rFonts w:ascii="Times New Roman" w:hAnsi="Times New Roman"/>
+                <w:b w:val="0"/>
+                <w:sz w:val="20"/>
+              </w:rPr>
+              <w:t>1/9</w:t>
+            </w:r>
+          </w:p>
+        </w:tc>
+      </w:tr>
+      <w:tr>
+        <w:trPr>
+          <w:cantSplit/>
+        </w:trPr>
+        <w:tc>
+          <w:tcPr>
+            <w:tcW w:type="dxa" w:w="4752"/>
+          </w:tcPr>
+          <w:p>
+            <w:pPr>
+              <w:spacing w:after="80"/>
+            </w:pPr>
+            <w:r>
+              <w:rPr>
+                <w:rFonts w:ascii="Times New Roman" w:hAnsi="Times New Roman"/>
+                <w:b w:val="0"/>
+                <w:sz w:val="20"/>
+              </w:rPr>
+              <w:t>GSEA-GSVA agreement in effect direction</w:t>
+            </w:r>
+          </w:p>
+        </w:tc>
+        <w:tc>
+          <w:tcPr>
+            <w:tcW w:type="dxa" w:w="1440"/>
+          </w:tcPr>
+          <w:p>
+            <w:pPr>
+              <w:spacing w:after="80"/>
+            </w:pPr>
+            <w:r>
+              <w:rPr>
+                <w:rFonts w:ascii="Times New Roman" w:hAnsi="Times New Roman"/>
+                <w:b w:val="0"/>
+                <w:sz w:val="20"/>
+              </w:rPr>
+              <w:t>Shared</w:t>
+            </w:r>
+          </w:p>
+        </w:tc>
+        <w:tc>
+          <w:tcPr>
+            <w:tcW w:type="dxa" w:w="950"/>
+          </w:tcPr>
+          <w:p>
+            <w:pPr>
+              <w:spacing w:after="80"/>
+            </w:pPr>
+            <w:r>
+              <w:rPr>
+                <w:rFonts w:ascii="Times New Roman" w:hAnsi="Times New Roman"/>
+                <w:b w:val="0"/>
+                <w:sz w:val="20"/>
+              </w:rPr>
+              <w:t>11/11</w:t>
+            </w:r>
+          </w:p>
+        </w:tc>
+        <w:tc>
+          <w:tcPr>
+            <w:tcW w:type="dxa" w:w="950"/>
+          </w:tcPr>
+          <w:p>
+            <w:pPr>
+              <w:spacing w:after="80"/>
+            </w:pPr>
+            <w:r>
+              <w:rPr>
+                <w:rFonts w:ascii="Times New Roman" w:hAnsi="Times New Roman"/>
+                <w:b w:val="0"/>
+                <w:sz w:val="20"/>
+              </w:rPr>
+              <w:t>11/11</w:t>
+            </w:r>
+          </w:p>
+        </w:tc>
+        <w:tc>
+          <w:tcPr>
+            <w:tcW w:type="dxa" w:w="950"/>
+          </w:tcPr>
+          <w:p>
+            <w:pPr>
+              <w:spacing w:after="80"/>
+            </w:pPr>
+            <w:r>
+              <w:rPr>
+                <w:rFonts w:ascii="Times New Roman" w:hAnsi="Times New Roman"/>
+                <w:b w:val="0"/>
+                <w:sz w:val="20"/>
+              </w:rPr>
+              <w:t>11/11</w:t>
+            </w:r>
+          </w:p>
+        </w:tc>
+      </w:tr>
+      <w:tr>
+        <w:trPr>
+          <w:cantSplit/>
+        </w:trPr>
+        <w:tc>
+          <w:tcPr>
+            <w:tcW w:type="dxa" w:w="4752"/>
+          </w:tcPr>
+          <w:p>
+            <w:pPr>
+              <w:spacing w:after="80"/>
+            </w:pPr>
+            <w:r>
+              <w:rPr>
+                <w:rFonts w:ascii="Times New Roman" w:hAnsi="Times New Roman"/>
+                <w:b w:val="0"/>
+                <w:sz w:val="20"/>
+              </w:rPr>
+              <w:t>GSEA-GSVA agreement in effect direction</w:t>
+            </w:r>
+          </w:p>
+        </w:tc>
+        <w:tc>
+          <w:tcPr>
+            <w:tcW w:type="dxa" w:w="1440"/>
+          </w:tcPr>
+          <w:p>
+            <w:pPr>
+              <w:spacing w:after="80"/>
+            </w:pPr>
+            <w:r>
+              <w:rPr>
+                <w:rFonts w:ascii="Times New Roman" w:hAnsi="Times New Roman"/>
+                <w:b w:val="0"/>
+                <w:sz w:val="20"/>
+              </w:rPr>
+              <w:t>Opposite</w:t>
+            </w:r>
+          </w:p>
+        </w:tc>
+        <w:tc>
+          <w:tcPr>
+            <w:tcW w:type="dxa" w:w="950"/>
+          </w:tcPr>
+          <w:p>
+            <w:pPr>
+              <w:spacing w:after="80"/>
+            </w:pPr>
+            <w:r>
+              <w:rPr>
+                <w:rFonts w:ascii="Times New Roman" w:hAnsi="Times New Roman"/>
+                <w:b w:val="0"/>
+                <w:sz w:val="20"/>
+              </w:rPr>
+              <w:t>9/9</w:t>
+            </w:r>
+          </w:p>
+        </w:tc>
+        <w:tc>
+          <w:tcPr>
+            <w:tcW w:type="dxa" w:w="950"/>
+          </w:tcPr>
+          <w:p>
+            <w:pPr>
+              <w:spacing w:after="80"/>
+            </w:pPr>
+            <w:r>
+              <w:rPr>
+                <w:rFonts w:ascii="Times New Roman" w:hAnsi="Times New Roman"/>
+                <w:b w:val="0"/>
+                <w:sz w:val="20"/>
+              </w:rPr>
+              <w:t>6/9</w:t>
+            </w:r>
+          </w:p>
+        </w:tc>
+        <w:tc>
+          <w:tcPr>
+            <w:tcW w:type="dxa" w:w="950"/>
+          </w:tcPr>
+          <w:p>
+            <w:pPr>
+              <w:spacing w:after="80"/>
+            </w:pPr>
+            <w:r>
+              <w:rPr>
+                <w:rFonts w:ascii="Times New Roman" w:hAnsi="Times New Roman"/>
+                <w:b w:val="0"/>
+                <w:sz w:val="20"/>
+              </w:rPr>
+              <w:t>3/9</w:t>
+            </w:r>
+          </w:p>
+        </w:tc>
+      </w:tr>
+      <w:tr>
+        <w:trPr>
+          <w:cantSplit/>
+        </w:trPr>
+        <w:tc>
+          <w:tcPr>
+            <w:tcW w:type="dxa" w:w="4752"/>
+          </w:tcPr>
+          <w:p>
+            <w:pPr>
+              <w:spacing w:after="80"/>
+            </w:pPr>
+            <w:r>
+              <w:rPr>
+                <w:rFonts w:ascii="Times New Roman" w:hAnsi="Times New Roman"/>
+                <w:b w:val="0"/>
+                <w:sz w:val="20"/>
+              </w:rPr>
+              <w:t>Pathways with original GSVA FDR below 0.05</w:t>
+            </w:r>
+          </w:p>
+        </w:tc>
+        <w:tc>
+          <w:tcPr>
+            <w:tcW w:type="dxa" w:w="1440"/>
+          </w:tcPr>
+          <w:p>
+            <w:pPr>
+              <w:spacing w:after="80"/>
+            </w:pPr>
+            <w:r>
+              <w:rPr>
+                <w:rFonts w:ascii="Times New Roman" w:hAnsi="Times New Roman"/>
+                <w:b w:val="0"/>
+                <w:sz w:val="20"/>
+              </w:rPr>
+              <w:t>Shared</w:t>
+            </w:r>
+          </w:p>
+        </w:tc>
+        <w:tc>
+          <w:tcPr>
+            <w:tcW w:type="dxa" w:w="950"/>
+          </w:tcPr>
+          <w:p>
+            <w:pPr>
+              <w:spacing w:after="80"/>
+            </w:pPr>
+            <w:r>
+              <w:rPr>
+                <w:rFonts w:ascii="Times New Roman" w:hAnsi="Times New Roman"/>
+                <w:b w:val="0"/>
+                <w:sz w:val="20"/>
+              </w:rPr>
+              <w:t>0/11</w:t>
+            </w:r>
+          </w:p>
+        </w:tc>
+        <w:tc>
+          <w:tcPr>
+            <w:tcW w:type="dxa" w:w="950"/>
+          </w:tcPr>
+          <w:p>
+            <w:pPr>
+              <w:spacing w:after="80"/>
+            </w:pPr>
+            <w:r>
+              <w:rPr>
+                <w:rFonts w:ascii="Times New Roman" w:hAnsi="Times New Roman"/>
+                <w:b w:val="0"/>
+                <w:sz w:val="20"/>
+              </w:rPr>
+              <w:t>7/11</w:t>
+            </w:r>
+          </w:p>
+        </w:tc>
+        <w:tc>
+          <w:tcPr>
+            <w:tcW w:type="dxa" w:w="950"/>
+          </w:tcPr>
+          <w:p>
+            <w:pPr>
+              <w:spacing w:after="80"/>
+            </w:pPr>
+            <w:r>
+              <w:rPr>
+                <w:rFonts w:ascii="Times New Roman" w:hAnsi="Times New Roman"/>
+                <w:b w:val="0"/>
+                <w:sz w:val="20"/>
+              </w:rPr>
+              <w:t>0/11</w:t>
+            </w:r>
+          </w:p>
+        </w:tc>
+      </w:tr>
+      <w:tr>
+        <w:trPr>
+          <w:cantSplit/>
+        </w:trPr>
+        <w:tc>
+          <w:tcPr>
+            <w:tcW w:type="dxa" w:w="4752"/>
+          </w:tcPr>
+          <w:p>
+            <w:pPr>
+              <w:spacing w:after="80"/>
+            </w:pPr>
+            <w:r>
+              <w:rPr>
+                <w:rFonts w:ascii="Times New Roman" w:hAnsi="Times New Roman"/>
+                <w:b w:val="0"/>
+                <w:sz w:val="20"/>
+              </w:rPr>
+              <w:t>Pathways with original GSVA FDR below 0.05</w:t>
+            </w:r>
+          </w:p>
+        </w:tc>
+        <w:tc>
+          <w:tcPr>
+            <w:tcW w:type="dxa" w:w="1440"/>
+          </w:tcPr>
+          <w:p>
+            <w:pPr>
+              <w:spacing w:after="80"/>
+            </w:pPr>
+            <w:r>
+              <w:rPr>
+                <w:rFonts w:ascii="Times New Roman" w:hAnsi="Times New Roman"/>
+                <w:b w:val="0"/>
+                <w:sz w:val="20"/>
+              </w:rPr>
+              <w:t>Opposite</w:t>
+            </w:r>
+          </w:p>
+        </w:tc>
+        <w:tc>
+          <w:tcPr>
+            <w:tcW w:type="dxa" w:w="950"/>
+          </w:tcPr>
+          <w:p>
+            <w:pPr>
+              <w:spacing w:after="80"/>
+            </w:pPr>
+            <w:r>
+              <w:rPr>
+                <w:rFonts w:ascii="Times New Roman" w:hAnsi="Times New Roman"/>
+                <w:b w:val="0"/>
+                <w:sz w:val="20"/>
+              </w:rPr>
+              <w:t>0/9</w:t>
+            </w:r>
+          </w:p>
+        </w:tc>
+        <w:tc>
+          <w:tcPr>
+            <w:tcW w:type="dxa" w:w="950"/>
+          </w:tcPr>
+          <w:p>
+            <w:pPr>
+              <w:spacing w:after="80"/>
+            </w:pPr>
+            <w:r>
+              <w:rPr>
+                <w:rFonts w:ascii="Times New Roman" w:hAnsi="Times New Roman"/>
+                <w:b w:val="0"/>
+                <w:sz w:val="20"/>
+              </w:rPr>
+              <w:t>2/9</w:t>
+            </w:r>
+          </w:p>
+        </w:tc>
+        <w:tc>
+          <w:tcPr>
+            <w:tcW w:type="dxa" w:w="950"/>
+          </w:tcPr>
+          <w:p>
+            <w:pPr>
+              <w:spacing w:after="80"/>
+            </w:pPr>
+            <w:r>
+              <w:rPr>
+                <w:rFonts w:ascii="Times New Roman" w:hAnsi="Times New Roman"/>
+                <w:b w:val="0"/>
+                <w:sz w:val="20"/>
+              </w:rPr>
+              <w:t>0/9</w:t>
+            </w:r>
+          </w:p>
+        </w:tc>
+      </w:tr>
+    </w:tbl>
+    <w:p>
+      <w:r>
+        <w:t>Direction stability is descriptive. For genes, each sample omission retains the strict sign of the neuropathy minus control difference in mean log2(normalized count + 1). For pathways, the corresponding difference uses archived GSVA scores. Normalization and scoring remain fixed; DESeq2 and limma are not refitted, and no new P values or FDR are calculated. Stability is not a significance test.</w:t>
+      </w:r>
+    </w:p>
+    <w:p>
+      <w:r>
+        <w:t>The direction-sensitive shared genes are Tln1 in NC and Cd14, Parp14, Dhcr7 and Syt11 in CCI. Cdk1 and Cdkn1a retain positive descriptive differences after every omission in all three studies. Tissue remodeling is the direction-sensitive shared pathway in NC.</w:t>
+      </w:r>
+    </w:p>
+    <w:p>
+      <w:r>
+        <w:t>All five opposite-direction genes retain their descriptive directions in OIPN and NC. In CCI, only Col4a2 remains negative after every omission; Cav1, Cdh5, Tns2 and Wnt6 can change sign. None of these five genes has original gene FDR below 0.05 in CCI.</w:t>
+      </w:r>
+    </w:p>
+    <w:p>
+      <w:r>
+        <w:t>The sole stable opposite-category GSVA term in CCI is Schwann cell differentiation. Its positive GSVA effect disagrees with its negative GSEA NES. The stability counts refer to each GSVA baseline, not agreement with GSEA. GSEA and GSVA use the same samples and are complementary evidence, not independent validation.</w:t>
       </w:r>
     </w:p>
     <w:sectPr>

</xml_diff>